<commit_message>
Unidad 2 - Ejercicio guiado
</commit_message>
<xml_diff>
--- a/documentos/Actividad práctica Consumo de servicios web con REST API.docx
+++ b/documentos/Actividad práctica Consumo de servicios web con REST API.docx
@@ -4,8 +4,13 @@
   <w:body>
     <w:p>
       <w:r>
-        <w:t>2. Instalación de librería requests</w:t>
-      </w:r>
+        <w:t xml:space="preserve">2. Instalación de librería </w:t>
+      </w:r>
+      <w:proofErr w:type="spellStart"/>
+      <w:r>
+        <w:t>requests</w:t>
+      </w:r>
+      <w:proofErr w:type="spellEnd"/>
     </w:p>
     <w:p>
       <w:r>
@@ -293,9 +298,11 @@
               <w:pStyle w:val="Prrafodelista"/>
               <w:ind w:left="0"/>
             </w:pPr>
+            <w:proofErr w:type="spellStart"/>
             <w:r>
               <w:t>Create</w:t>
             </w:r>
+            <w:proofErr w:type="spellEnd"/>
           </w:p>
         </w:tc>
         <w:tc>
@@ -351,9 +358,11 @@
               <w:pStyle w:val="Prrafodelista"/>
               <w:ind w:left="0"/>
             </w:pPr>
+            <w:proofErr w:type="spellStart"/>
             <w:r>
               <w:t>Update</w:t>
             </w:r>
+            <w:proofErr w:type="spellEnd"/>
           </w:p>
         </w:tc>
         <w:tc>
@@ -410,9 +419,11 @@
               <w:pStyle w:val="Prrafodelista"/>
               <w:ind w:left="0"/>
             </w:pPr>
+            <w:proofErr w:type="spellStart"/>
             <w:r>
               <w:t>Update</w:t>
             </w:r>
+            <w:proofErr w:type="spellEnd"/>
           </w:p>
         </w:tc>
         <w:tc>
@@ -468,9 +479,11 @@
               <w:pStyle w:val="Prrafodelista"/>
               <w:ind w:left="0"/>
             </w:pPr>
+            <w:proofErr w:type="spellStart"/>
             <w:r>
               <w:t>Delete</w:t>
             </w:r>
+            <w:proofErr w:type="spellEnd"/>
           </w:p>
         </w:tc>
         <w:tc>
@@ -1365,7 +1378,15 @@
     </w:p>
     <w:p>
       <w:r>
-        <w:t>Existen 10 resultados para el usuario con userid=3</w:t>
+        <w:t xml:space="preserve">Existen 10 resultados para el usuario con </w:t>
+      </w:r>
+      <w:proofErr w:type="spellStart"/>
+      <w:r>
+        <w:t>userid</w:t>
+      </w:r>
+      <w:proofErr w:type="spellEnd"/>
+      <w:r>
+        <w:t>=3</w:t>
       </w:r>
     </w:p>
     <w:p>
@@ -1429,6 +1450,22 @@
       <w:r>
         <w:lastRenderedPageBreak/>
         <w:t>B5.</w:t>
+      </w:r>
+    </w:p>
+    <w:p>
+      <w:r>
+        <w:t xml:space="preserve">B6. </w:t>
+      </w:r>
+      <w:hyperlink r:id="rId13" w:history="1">
+        <w:r>
+          <w:rPr>
+            <w:rStyle w:val="Hipervnculo"/>
+          </w:rPr>
+          <w:t>https://jsonplaceholder.typicode.com/posts/1</w:t>
+        </w:r>
+      </w:hyperlink>
+      <w:r>
+        <w:t xml:space="preserve">  (PUT)</w:t>
       </w:r>
     </w:p>
     <w:sectPr>

</xml_diff>